<commit_message>
The Basic Pentesting CTF was completed!
</commit_message>
<xml_diff>
--- a/THM_challenges/Easy/Basic Pentesting/Basic_Pentesting_Solution_Documentation.docx
+++ b/THM_challenges/Easy/Basic Pentesting/Basic_Pentesting_Solution_Documentation.docx
@@ -64,6 +64,9 @@
         </w:rPr>
       </w:pPr>
       <w:r>
+        <w:rPr>
+          <w:noProof/>
+        </w:rPr>
         <w:drawing>
           <wp:inline distT="0" distB="0" distL="0" distR="0" wp14:anchorId="1174C4E8" wp14:editId="2FE218C0">
             <wp:extent cx="4711700" cy="3443414"/>
@@ -124,6 +127,9 @@
     </w:p>
     <w:p>
       <w:r>
+        <w:rPr>
+          <w:noProof/>
+        </w:rPr>
         <w:drawing>
           <wp:inline distT="0" distB="0" distL="0" distR="0" wp14:anchorId="09E046A8" wp14:editId="7C0356E6">
             <wp:extent cx="2998730" cy="1333616"/>
@@ -168,6 +174,9 @@
     </w:p>
     <w:p>
       <w:r>
+        <w:rPr>
+          <w:noProof/>
+        </w:rPr>
         <w:drawing>
           <wp:inline distT="0" distB="0" distL="0" distR="0" wp14:anchorId="2ADB52D4" wp14:editId="57573DD5">
             <wp:extent cx="2549790" cy="499533"/>
@@ -221,6 +230,9 @@
     </w:p>
     <w:p>
       <w:r>
+        <w:rPr>
+          <w:noProof/>
+        </w:rPr>
         <w:drawing>
           <wp:inline distT="0" distB="0" distL="0" distR="0" wp14:anchorId="37A94185" wp14:editId="370A903F">
             <wp:extent cx="4262966" cy="1888025"/>
@@ -266,6 +278,9 @@
     </w:p>
     <w:p>
       <w:r>
+        <w:rPr>
+          <w:noProof/>
+        </w:rPr>
         <w:drawing>
           <wp:inline distT="0" distB="0" distL="0" distR="0" wp14:anchorId="41A24062" wp14:editId="088CC5D9">
             <wp:extent cx="4000847" cy="2331922"/>
@@ -315,6 +330,9 @@
     </w:p>
     <w:p>
       <w:r>
+        <w:rPr>
+          <w:noProof/>
+        </w:rPr>
         <w:drawing>
           <wp:inline distT="0" distB="0" distL="0" distR="0" wp14:anchorId="32F502C5" wp14:editId="685D962E">
             <wp:extent cx="4931833" cy="1506451"/>
@@ -359,6 +377,9 @@
     </w:p>
     <w:p>
       <w:r>
+        <w:rPr>
+          <w:noProof/>
+        </w:rPr>
         <w:drawing>
           <wp:inline distT="0" distB="0" distL="0" distR="0" wp14:anchorId="2F7F7788" wp14:editId="135306A4">
             <wp:extent cx="4877223" cy="1474598"/>
@@ -413,60 +434,589 @@
         <w:t>is</w:t>
       </w:r>
       <w:r>
-        <w:t xml:space="preserve"> a vulnerability </w:t>
+        <w:t xml:space="preserve"> </w:t>
+      </w:r>
+      <w:r>
+        <w:t>Apache struts version 2.5.12 service with the plugin named “REST</w:t>
+      </w:r>
+      <w:r>
+        <w:t xml:space="preserve"> </w:t>
       </w:r>
       <w:r>
         <w:t>on the target machine</w:t>
       </w:r>
       <w:r>
-        <w:t xml:space="preserve"> (the </w:t>
-      </w:r>
-      <w:r>
-        <w:t>CVE-2017-9805</w:t>
+        <w:t xml:space="preserve">. In addition, it also got </w:t>
+      </w:r>
+      <w:r>
+        <w:t>SMB</w:t>
+      </w:r>
+      <w:r>
+        <w:t xml:space="preserve"> service running.</w:t>
+      </w:r>
+    </w:p>
+    <w:p>
+      <w:r>
+        <w:t xml:space="preserve">I read </w:t>
+      </w:r>
+      <w:r>
+        <w:t xml:space="preserve">on the thm page </w:t>
+      </w:r>
+      <w:r>
+        <w:t xml:space="preserve">that I need to brute force credentials </w:t>
+      </w:r>
+      <w:r>
+        <w:t xml:space="preserve">(username and password), but I didn’t know credentials of which service. I returned back to the results of the Nmap scan, and I remembered that the target also run </w:t>
+      </w:r>
+      <w:r>
+        <w:t>“</w:t>
+      </w:r>
+      <w:r>
+        <w:t>samba</w:t>
+      </w:r>
+      <w:r>
+        <w:t>”</w:t>
+      </w:r>
+      <w:r>
+        <w:t>.</w:t>
+      </w:r>
+    </w:p>
+    <w:p>
+      <w:r>
+        <w:t xml:space="preserve">This led me </w:t>
+      </w:r>
+      <w:r>
+        <w:t xml:space="preserve">to </w:t>
+      </w:r>
+      <w:r>
+        <w:t>use the enumeration tool named “enum4linux</w:t>
+      </w:r>
+      <w:r>
+        <w:t>”</w:t>
+      </w:r>
+      <w:r>
+        <w:t xml:space="preserve"> to </w:t>
+      </w:r>
+      <w:r>
+        <w:t>enumerate usernames over the machine</w:t>
+      </w:r>
+      <w:r>
+        <w:t>:</w:t>
+      </w:r>
+    </w:p>
+    <w:p>
+      <w:r>
+        <w:drawing>
+          <wp:inline distT="0" distB="0" distL="0" distR="0" wp14:anchorId="6D327FED" wp14:editId="16595A50">
+            <wp:extent cx="5864158" cy="922867"/>
+            <wp:effectExtent l="0" t="0" r="3810" b="0"/>
+            <wp:docPr id="2018985437" name="תמונה 1" descr="תמונה שמכילה טקסט, צילום מסך, גופן&#10;&#10;תוכן בינה מלאכותית גנרטיבית עשוי להיות שגוי."/>
+            <wp:cNvGraphicFramePr>
+              <a:graphicFrameLocks xmlns:a="http://schemas.openxmlformats.org/drawingml/2006/main" noChangeAspect="1"/>
+            </wp:cNvGraphicFramePr>
+            <a:graphic xmlns:a="http://schemas.openxmlformats.org/drawingml/2006/main">
+              <a:graphicData uri="http://schemas.openxmlformats.org/drawingml/2006/picture">
+                <pic:pic xmlns:pic="http://schemas.openxmlformats.org/drawingml/2006/picture">
+                  <pic:nvPicPr>
+                    <pic:cNvPr id="2018985437" name="תמונה 1" descr="תמונה שמכילה טקסט, צילום מסך, גופן&#10;&#10;תוכן בינה מלאכותית גנרטיבית עשוי להיות שגוי."/>
+                    <pic:cNvPicPr/>
+                  </pic:nvPicPr>
+                  <pic:blipFill>
+                    <a:blip r:embed="rId11"/>
+                    <a:stretch>
+                      <a:fillRect/>
+                    </a:stretch>
+                  </pic:blipFill>
+                  <pic:spPr>
+                    <a:xfrm>
+                      <a:off x="0" y="0"/>
+                      <a:ext cx="5874842" cy="924548"/>
+                    </a:xfrm>
+                    <a:prstGeom prst="rect">
+                      <a:avLst/>
+                    </a:prstGeom>
+                  </pic:spPr>
+                </pic:pic>
+              </a:graphicData>
+            </a:graphic>
+          </wp:inline>
+        </w:drawing>
+      </w:r>
+    </w:p>
+    <w:p>
+      <w:r>
+        <w:lastRenderedPageBreak/>
+        <w:t xml:space="preserve">After finding the user jan, I used “Hydra” to </w:t>
+      </w:r>
+      <w:r>
+        <w:t>bruteforce its password</w:t>
+      </w:r>
+      <w:r>
+        <w:t xml:space="preserve"> over ssh</w:t>
+      </w:r>
+      <w:r>
+        <w:t>:</w:t>
+      </w:r>
+    </w:p>
+    <w:p>
+      <w:r>
+        <w:t xml:space="preserve"> </w:t>
+      </w:r>
+      <w:r>
+        <w:drawing>
+          <wp:inline distT="0" distB="0" distL="0" distR="0" wp14:anchorId="5A09D7AF" wp14:editId="46A44065">
+            <wp:extent cx="7163421" cy="2267146"/>
+            <wp:effectExtent l="0" t="0" r="0" b="0"/>
+            <wp:docPr id="1926952966" name="תמונה 1"/>
+            <wp:cNvGraphicFramePr>
+              <a:graphicFrameLocks xmlns:a="http://schemas.openxmlformats.org/drawingml/2006/main" noChangeAspect="1"/>
+            </wp:cNvGraphicFramePr>
+            <a:graphic xmlns:a="http://schemas.openxmlformats.org/drawingml/2006/main">
+              <a:graphicData uri="http://schemas.openxmlformats.org/drawingml/2006/picture">
+                <pic:pic xmlns:pic="http://schemas.openxmlformats.org/drawingml/2006/picture">
+                  <pic:nvPicPr>
+                    <pic:cNvPr id="1926952966" name=""/>
+                    <pic:cNvPicPr/>
+                  </pic:nvPicPr>
+                  <pic:blipFill>
+                    <a:blip r:embed="rId12"/>
+                    <a:stretch>
+                      <a:fillRect/>
+                    </a:stretch>
+                  </pic:blipFill>
+                  <pic:spPr>
+                    <a:xfrm>
+                      <a:off x="0" y="0"/>
+                      <a:ext cx="7163421" cy="2267146"/>
+                    </a:xfrm>
+                    <a:prstGeom prst="rect">
+                      <a:avLst/>
+                    </a:prstGeom>
+                  </pic:spPr>
+                </pic:pic>
+              </a:graphicData>
+            </a:graphic>
+          </wp:inline>
+        </w:drawing>
+      </w:r>
+    </w:p>
+    <w:p>
+      <w:r>
+        <w:t>Afterwards, I accessed the target via its open ssh port:</w:t>
+      </w:r>
+    </w:p>
+    <w:p>
+      <w:r>
+        <w:drawing>
+          <wp:inline distT="0" distB="0" distL="0" distR="0" wp14:anchorId="1FD35B03" wp14:editId="0A574FDE">
+            <wp:extent cx="6668078" cy="5505927"/>
+            <wp:effectExtent l="0" t="0" r="0" b="0"/>
+            <wp:docPr id="1333908001" name="תמונה 1"/>
+            <wp:cNvGraphicFramePr>
+              <a:graphicFrameLocks xmlns:a="http://schemas.openxmlformats.org/drawingml/2006/main" noChangeAspect="1"/>
+            </wp:cNvGraphicFramePr>
+            <a:graphic xmlns:a="http://schemas.openxmlformats.org/drawingml/2006/main">
+              <a:graphicData uri="http://schemas.openxmlformats.org/drawingml/2006/picture">
+                <pic:pic xmlns:pic="http://schemas.openxmlformats.org/drawingml/2006/picture">
+                  <pic:nvPicPr>
+                    <pic:cNvPr id="1333908001" name=""/>
+                    <pic:cNvPicPr/>
+                  </pic:nvPicPr>
+                  <pic:blipFill>
+                    <a:blip r:embed="rId13"/>
+                    <a:stretch>
+                      <a:fillRect/>
+                    </a:stretch>
+                  </pic:blipFill>
+                  <pic:spPr>
+                    <a:xfrm>
+                      <a:off x="0" y="0"/>
+                      <a:ext cx="6668078" cy="5505927"/>
+                    </a:xfrm>
+                    <a:prstGeom prst="rect">
+                      <a:avLst/>
+                    </a:prstGeom>
+                  </pic:spPr>
+                </pic:pic>
+              </a:graphicData>
+            </a:graphic>
+          </wp:inline>
+        </w:drawing>
+      </w:r>
+    </w:p>
+    <w:p/>
+    <w:p/>
+    <w:p/>
+    <w:p>
+      <w:r>
+        <w:lastRenderedPageBreak/>
+        <w:t>After navigating around the machine, I found on kay’s directory a private open ssh key which I can use to escalate my privileges to kay’s:</w:t>
+      </w:r>
+    </w:p>
+    <w:p>
+      <w:r>
+        <w:drawing>
+          <wp:inline distT="0" distB="0" distL="0" distR="0" wp14:anchorId="6C579518" wp14:editId="76FFAF21">
+            <wp:extent cx="3867485" cy="2465284"/>
+            <wp:effectExtent l="0" t="0" r="0" b="0"/>
+            <wp:docPr id="1637510621" name="תמונה 1"/>
+            <wp:cNvGraphicFramePr>
+              <a:graphicFrameLocks xmlns:a="http://schemas.openxmlformats.org/drawingml/2006/main" noChangeAspect="1"/>
+            </wp:cNvGraphicFramePr>
+            <a:graphic xmlns:a="http://schemas.openxmlformats.org/drawingml/2006/main">
+              <a:graphicData uri="http://schemas.openxmlformats.org/drawingml/2006/picture">
+                <pic:pic xmlns:pic="http://schemas.openxmlformats.org/drawingml/2006/picture">
+                  <pic:nvPicPr>
+                    <pic:cNvPr id="1637510621" name=""/>
+                    <pic:cNvPicPr/>
+                  </pic:nvPicPr>
+                  <pic:blipFill>
+                    <a:blip r:embed="rId14"/>
+                    <a:stretch>
+                      <a:fillRect/>
+                    </a:stretch>
+                  </pic:blipFill>
+                  <pic:spPr>
+                    <a:xfrm>
+                      <a:off x="0" y="0"/>
+                      <a:ext cx="3867485" cy="2465284"/>
+                    </a:xfrm>
+                    <a:prstGeom prst="rect">
+                      <a:avLst/>
+                    </a:prstGeom>
+                  </pic:spPr>
+                </pic:pic>
+              </a:graphicData>
+            </a:graphic>
+          </wp:inline>
+        </w:drawing>
+      </w:r>
+    </w:p>
+    <w:p>
+      <w:r>
+        <w:t>I moved this file to my machine via a basic python http server</w:t>
+      </w:r>
+      <w:r>
+        <w:t>:</w:t>
+      </w:r>
+    </w:p>
+    <w:p>
+      <w:r>
+        <w:drawing>
+          <wp:inline distT="0" distB="0" distL="0" distR="0" wp14:anchorId="20DB3442" wp14:editId="147095C1">
+            <wp:extent cx="3734124" cy="438188"/>
+            <wp:effectExtent l="0" t="0" r="0" b="0"/>
+            <wp:docPr id="375117080" name="תמונה 1"/>
+            <wp:cNvGraphicFramePr>
+              <a:graphicFrameLocks xmlns:a="http://schemas.openxmlformats.org/drawingml/2006/main" noChangeAspect="1"/>
+            </wp:cNvGraphicFramePr>
+            <a:graphic xmlns:a="http://schemas.openxmlformats.org/drawingml/2006/main">
+              <a:graphicData uri="http://schemas.openxmlformats.org/drawingml/2006/picture">
+                <pic:pic xmlns:pic="http://schemas.openxmlformats.org/drawingml/2006/picture">
+                  <pic:nvPicPr>
+                    <pic:cNvPr id="375117080" name=""/>
+                    <pic:cNvPicPr/>
+                  </pic:nvPicPr>
+                  <pic:blipFill>
+                    <a:blip r:embed="rId15"/>
+                    <a:stretch>
+                      <a:fillRect/>
+                    </a:stretch>
+                  </pic:blipFill>
+                  <pic:spPr>
+                    <a:xfrm>
+                      <a:off x="0" y="0"/>
+                      <a:ext cx="3734124" cy="438188"/>
+                    </a:xfrm>
+                    <a:prstGeom prst="rect">
+                      <a:avLst/>
+                    </a:prstGeom>
+                  </pic:spPr>
+                </pic:pic>
+              </a:graphicData>
+            </a:graphic>
+          </wp:inline>
+        </w:drawing>
+      </w:r>
+    </w:p>
+    <w:p>
+      <w:r>
+        <w:drawing>
+          <wp:inline distT="0" distB="0" distL="0" distR="0" wp14:anchorId="7753B298" wp14:editId="0C9C7274">
+            <wp:extent cx="6934801" cy="1466977"/>
+            <wp:effectExtent l="0" t="0" r="0" b="0"/>
+            <wp:docPr id="2147009743" name="תמונה 1" descr="תמונה שמכילה טקסט, גופן, צילום מסך&#10;&#10;תוכן בינה מלאכותית גנרטיבית עשוי להיות שגוי."/>
+            <wp:cNvGraphicFramePr>
+              <a:graphicFrameLocks xmlns:a="http://schemas.openxmlformats.org/drawingml/2006/main" noChangeAspect="1"/>
+            </wp:cNvGraphicFramePr>
+            <a:graphic xmlns:a="http://schemas.openxmlformats.org/drawingml/2006/main">
+              <a:graphicData uri="http://schemas.openxmlformats.org/drawingml/2006/picture">
+                <pic:pic xmlns:pic="http://schemas.openxmlformats.org/drawingml/2006/picture">
+                  <pic:nvPicPr>
+                    <pic:cNvPr id="2147009743" name="תמונה 1" descr="תמונה שמכילה טקסט, גופן, צילום מסך&#10;&#10;תוכן בינה מלאכותית גנרטיבית עשוי להיות שגוי."/>
+                    <pic:cNvPicPr/>
+                  </pic:nvPicPr>
+                  <pic:blipFill>
+                    <a:blip r:embed="rId16"/>
+                    <a:stretch>
+                      <a:fillRect/>
+                    </a:stretch>
+                  </pic:blipFill>
+                  <pic:spPr>
+                    <a:xfrm>
+                      <a:off x="0" y="0"/>
+                      <a:ext cx="6934801" cy="1466977"/>
+                    </a:xfrm>
+                    <a:prstGeom prst="rect">
+                      <a:avLst/>
+                    </a:prstGeom>
+                  </pic:spPr>
+                </pic:pic>
+              </a:graphicData>
+            </a:graphic>
+          </wp:inline>
+        </w:drawing>
+      </w:r>
+    </w:p>
+    <w:p>
+      <w:r>
+        <w:t xml:space="preserve">Then, I </w:t>
+      </w:r>
+      <w:r>
+        <w:t xml:space="preserve">converted the id_rsa key to its hash, </w:t>
+      </w:r>
+      <w:r>
+        <w:t xml:space="preserve">decrypt </w:t>
+      </w:r>
+      <w:r>
+        <w:t>its</w:t>
+      </w:r>
+      <w:r>
+        <w:t xml:space="preserve"> passcode</w:t>
+      </w:r>
+      <w:r>
+        <w:t xml:space="preserve"> (from the </w:t>
+      </w:r>
+      <w:r>
+        <w:t>hash</w:t>
       </w:r>
       <w:r>
         <w:t>)</w:t>
       </w:r>
       <w:r>
-        <w:t xml:space="preserve">. The target had </w:t>
-      </w:r>
-      <w:r>
-        <w:t>Apache struts version 2.5.12</w:t>
-      </w:r>
-      <w:r>
-        <w:t xml:space="preserve"> service</w:t>
-      </w:r>
-      <w:r>
-        <w:t xml:space="preserve"> </w:t>
-      </w:r>
-      <w:r>
-        <w:t xml:space="preserve">with </w:t>
-      </w:r>
-      <w:r>
-        <w:t xml:space="preserve">the plugin named “REST” which </w:t>
-      </w:r>
-      <w:r>
-        <w:t>is prone</w:t>
-      </w:r>
-      <w:r>
-        <w:t xml:space="preserve"> to execute remote code over </w:t>
-      </w:r>
-      <w:r>
-        <w:t>the machine itself.</w:t>
-      </w:r>
-      <w:r>
-        <w:t xml:space="preserve"> I found an exploit for this </w:t>
-      </w:r>
-      <w:r>
-        <w:t xml:space="preserve">on </w:t>
-      </w:r>
-      <w:proofErr w:type="spellStart"/>
-      <w:r>
-        <w:t>github</w:t>
-      </w:r>
-      <w:proofErr w:type="spellEnd"/>
-      <w:r>
-        <w:t>:</w:t>
+        <w:t xml:space="preserve"> and </w:t>
+      </w:r>
+      <w:r>
+        <w:t>gave it the right permissions.</w:t>
+      </w:r>
+    </w:p>
+    <w:p>
+      <w:r>
+        <w:drawing>
+          <wp:inline distT="0" distB="0" distL="0" distR="0" wp14:anchorId="076ACB0F" wp14:editId="26FCAC4F">
+            <wp:extent cx="3467400" cy="438188"/>
+            <wp:effectExtent l="0" t="0" r="0" b="0"/>
+            <wp:docPr id="2218244" name="תמונה 1"/>
+            <wp:cNvGraphicFramePr>
+              <a:graphicFrameLocks xmlns:a="http://schemas.openxmlformats.org/drawingml/2006/main" noChangeAspect="1"/>
+            </wp:cNvGraphicFramePr>
+            <a:graphic xmlns:a="http://schemas.openxmlformats.org/drawingml/2006/main">
+              <a:graphicData uri="http://schemas.openxmlformats.org/drawingml/2006/picture">
+                <pic:pic xmlns:pic="http://schemas.openxmlformats.org/drawingml/2006/picture">
+                  <pic:nvPicPr>
+                    <pic:cNvPr id="2218244" name=""/>
+                    <pic:cNvPicPr/>
+                  </pic:nvPicPr>
+                  <pic:blipFill>
+                    <a:blip r:embed="rId17"/>
+                    <a:stretch>
+                      <a:fillRect/>
+                    </a:stretch>
+                  </pic:blipFill>
+                  <pic:spPr>
+                    <a:xfrm>
+                      <a:off x="0" y="0"/>
+                      <a:ext cx="3467400" cy="438188"/>
+                    </a:xfrm>
+                    <a:prstGeom prst="rect">
+                      <a:avLst/>
+                    </a:prstGeom>
+                  </pic:spPr>
+                </pic:pic>
+              </a:graphicData>
+            </a:graphic>
+          </wp:inline>
+        </w:drawing>
+      </w:r>
+    </w:p>
+    <w:p>
+      <w:r>
+        <w:drawing>
+          <wp:inline distT="0" distB="0" distL="0" distR="0" wp14:anchorId="4CF0C1E0" wp14:editId="4B4A9C72">
+            <wp:extent cx="5105842" cy="1562235"/>
+            <wp:effectExtent l="0" t="0" r="0" b="0"/>
+            <wp:docPr id="1351243984" name="תמונה 1"/>
+            <wp:cNvGraphicFramePr>
+              <a:graphicFrameLocks xmlns:a="http://schemas.openxmlformats.org/drawingml/2006/main" noChangeAspect="1"/>
+            </wp:cNvGraphicFramePr>
+            <a:graphic xmlns:a="http://schemas.openxmlformats.org/drawingml/2006/main">
+              <a:graphicData uri="http://schemas.openxmlformats.org/drawingml/2006/picture">
+                <pic:pic xmlns:pic="http://schemas.openxmlformats.org/drawingml/2006/picture">
+                  <pic:nvPicPr>
+                    <pic:cNvPr id="1351243984" name=""/>
+                    <pic:cNvPicPr/>
+                  </pic:nvPicPr>
+                  <pic:blipFill>
+                    <a:blip r:embed="rId18"/>
+                    <a:stretch>
+                      <a:fillRect/>
+                    </a:stretch>
+                  </pic:blipFill>
+                  <pic:spPr>
+                    <a:xfrm>
+                      <a:off x="0" y="0"/>
+                      <a:ext cx="5105842" cy="1562235"/>
+                    </a:xfrm>
+                    <a:prstGeom prst="rect">
+                      <a:avLst/>
+                    </a:prstGeom>
+                  </pic:spPr>
+                </pic:pic>
+              </a:graphicData>
+            </a:graphic>
+          </wp:inline>
+        </w:drawing>
+      </w:r>
+    </w:p>
+    <w:p>
+      <w:r>
+        <w:drawing>
+          <wp:inline distT="0" distB="0" distL="0" distR="0" wp14:anchorId="48CA71A3" wp14:editId="1743D870">
+            <wp:extent cx="1562235" cy="331499"/>
+            <wp:effectExtent l="0" t="0" r="0" b="0"/>
+            <wp:docPr id="1228816292" name="תמונה 1" descr="תמונה שמכילה טקסט, גופן, צילום מסך, גרפיקה&#10;&#10;תוכן בינה מלאכותית גנרטיבית עשוי להיות שגוי."/>
+            <wp:cNvGraphicFramePr>
+              <a:graphicFrameLocks xmlns:a="http://schemas.openxmlformats.org/drawingml/2006/main" noChangeAspect="1"/>
+            </wp:cNvGraphicFramePr>
+            <a:graphic xmlns:a="http://schemas.openxmlformats.org/drawingml/2006/main">
+              <a:graphicData uri="http://schemas.openxmlformats.org/drawingml/2006/picture">
+                <pic:pic xmlns:pic="http://schemas.openxmlformats.org/drawingml/2006/picture">
+                  <pic:nvPicPr>
+                    <pic:cNvPr id="1228816292" name="תמונה 1" descr="תמונה שמכילה טקסט, גופן, צילום מסך, גרפיקה&#10;&#10;תוכן בינה מלאכותית גנרטיבית עשוי להיות שגוי."/>
+                    <pic:cNvPicPr/>
+                  </pic:nvPicPr>
+                  <pic:blipFill>
+                    <a:blip r:embed="rId19"/>
+                    <a:stretch>
+                      <a:fillRect/>
+                    </a:stretch>
+                  </pic:blipFill>
+                  <pic:spPr>
+                    <a:xfrm>
+                      <a:off x="0" y="0"/>
+                      <a:ext cx="1562235" cy="331499"/>
+                    </a:xfrm>
+                    <a:prstGeom prst="rect">
+                      <a:avLst/>
+                    </a:prstGeom>
+                  </pic:spPr>
+                </pic:pic>
+              </a:graphicData>
+            </a:graphic>
+          </wp:inline>
+        </w:drawing>
+      </w:r>
+    </w:p>
+    <w:p>
+      <w:r>
+        <w:t>And after completing everything, I got kay’s shell:</w:t>
+      </w:r>
+    </w:p>
+    <w:p>
+      <w:r>
+        <w:lastRenderedPageBreak/>
+        <w:drawing>
+          <wp:inline distT="0" distB="0" distL="0" distR="0" wp14:anchorId="61430C73" wp14:editId="3E18076A">
+            <wp:extent cx="6599492" cy="3798899"/>
+            <wp:effectExtent l="0" t="0" r="0" b="0"/>
+            <wp:docPr id="975303893" name="תמונה 1" descr="תמונה שמכילה טקסט, צילום מסך, תוכנה, גופן&#10;&#10;תוכן בינה מלאכותית גנרטיבית עשוי להיות שגוי."/>
+            <wp:cNvGraphicFramePr>
+              <a:graphicFrameLocks xmlns:a="http://schemas.openxmlformats.org/drawingml/2006/main" noChangeAspect="1"/>
+            </wp:cNvGraphicFramePr>
+            <a:graphic xmlns:a="http://schemas.openxmlformats.org/drawingml/2006/main">
+              <a:graphicData uri="http://schemas.openxmlformats.org/drawingml/2006/picture">
+                <pic:pic xmlns:pic="http://schemas.openxmlformats.org/drawingml/2006/picture">
+                  <pic:nvPicPr>
+                    <pic:cNvPr id="975303893" name="תמונה 1" descr="תמונה שמכילה טקסט, צילום מסך, תוכנה, גופן&#10;&#10;תוכן בינה מלאכותית גנרטיבית עשוי להיות שגוי."/>
+                    <pic:cNvPicPr/>
+                  </pic:nvPicPr>
+                  <pic:blipFill>
+                    <a:blip r:embed="rId20"/>
+                    <a:stretch>
+                      <a:fillRect/>
+                    </a:stretch>
+                  </pic:blipFill>
+                  <pic:spPr>
+                    <a:xfrm>
+                      <a:off x="0" y="0"/>
+                      <a:ext cx="6599492" cy="3798899"/>
+                    </a:xfrm>
+                    <a:prstGeom prst="rect">
+                      <a:avLst/>
+                    </a:prstGeom>
+                  </pic:spPr>
+                </pic:pic>
+              </a:graphicData>
+            </a:graphic>
+          </wp:inline>
+        </w:drawing>
+      </w:r>
+    </w:p>
+    <w:p>
+      <w:r>
+        <w:t xml:space="preserve">Here, </w:t>
+      </w:r>
+      <w:r>
+        <w:t>I found the password and finished this ctf:</w:t>
+      </w:r>
+    </w:p>
+    <w:p>
+      <w:r>
+        <w:drawing>
+          <wp:inline distT="0" distB="0" distL="0" distR="0" wp14:anchorId="564F2362" wp14:editId="350D5905">
+            <wp:extent cx="3505504" cy="609653"/>
+            <wp:effectExtent l="0" t="0" r="0" b="0"/>
+            <wp:docPr id="1749504079" name="תמונה 1"/>
+            <wp:cNvGraphicFramePr>
+              <a:graphicFrameLocks xmlns:a="http://schemas.openxmlformats.org/drawingml/2006/main" noChangeAspect="1"/>
+            </wp:cNvGraphicFramePr>
+            <a:graphic xmlns:a="http://schemas.openxmlformats.org/drawingml/2006/main">
+              <a:graphicData uri="http://schemas.openxmlformats.org/drawingml/2006/picture">
+                <pic:pic xmlns:pic="http://schemas.openxmlformats.org/drawingml/2006/picture">
+                  <pic:nvPicPr>
+                    <pic:cNvPr id="1749504079" name=""/>
+                    <pic:cNvPicPr/>
+                  </pic:nvPicPr>
+                  <pic:blipFill>
+                    <a:blip r:embed="rId21"/>
+                    <a:stretch>
+                      <a:fillRect/>
+                    </a:stretch>
+                  </pic:blipFill>
+                  <pic:spPr>
+                    <a:xfrm>
+                      <a:off x="0" y="0"/>
+                      <a:ext cx="3505504" cy="609653"/>
+                    </a:xfrm>
+                    <a:prstGeom prst="rect">
+                      <a:avLst/>
+                    </a:prstGeom>
+                  </pic:spPr>
+                </pic:pic>
+              </a:graphicData>
+            </a:graphic>
+          </wp:inline>
+        </w:drawing>
       </w:r>
     </w:p>
     <w:p/>
@@ -1084,6 +1634,7 @@
   <w:style w:type="character" w:default="1" w:styleId="a0">
     <w:name w:val="Default Paragraph Font"/>
     <w:uiPriority w:val="1"/>
+    <w:semiHidden/>
     <w:unhideWhenUsed/>
   </w:style>
   <w:style w:type="table" w:default="1" w:styleId="a1">

</xml_diff>